<commit_message>
Launching modul manajemen klien dan event
</commit_message>
<xml_diff>
--- a/User Feedback (gonna be updated after every sprint).docx
+++ b/User Feedback (gonna be updated after every sprint).docx
@@ -47,7 +47,34 @@
         <w:br/>
       </w:r>
     </w:p>
-    <w:p/>
+    <w:p>
+      <w:r>
+        <w:t>03</w:t>
+      </w:r>
+      <w:r>
+        <w:t>/1</w:t>
+      </w:r>
+      <w:r>
+        <w:t>2</w:t>
+      </w:r>
+      <w:r>
+        <w:t xml:space="preserve">/2025 </w:t>
+      </w:r>
+    </w:p>
+    <w:p>
+      <w:r>
+        <w:t>M</w:t>
+      </w:r>
+      <w:r>
+        <w:t>odul manajemen klien dan event</w:t>
+      </w:r>
+      <w:r>
+        <w:t xml:space="preserve"> asisten</w:t>
+      </w:r>
+      <w:r>
+        <w:t xml:space="preserve"> sudah selesai</w:t>
+      </w:r>
+    </w:p>
     <w:sectPr>
       <w:pgSz w:w="12240" w:h="15840"/>
       <w:pgMar w:top="1440" w:right="1440" w:bottom="1440" w:left="1440" w:header="720" w:footer="720" w:gutter="0"/>
@@ -456,6 +483,7 @@
   <w:style w:type="paragraph" w:default="1" w:styleId="Normal">
     <w:name w:val="Normal"/>
     <w:qFormat/>
+    <w:rsid w:val="004E2B1A"/>
   </w:style>
   <w:style w:type="paragraph" w:styleId="Heading1">
     <w:name w:val="heading 1"/>

</xml_diff>

<commit_message>
Updated user feedback for sprint 4
</commit_message>
<xml_diff>
--- a/User Feedback (gonna be updated after every sprint).docx
+++ b/User Feedback (gonna be updated after every sprint).docx
@@ -49,16 +49,7 @@
     </w:p>
     <w:p>
       <w:r>
-        <w:t>03</w:t>
-      </w:r>
-      <w:r>
-        <w:t>/1</w:t>
-      </w:r>
-      <w:r>
-        <w:t>2</w:t>
-      </w:r>
-      <w:r>
-        <w:t xml:space="preserve">/2025 </w:t>
+        <w:t xml:space="preserve">03/12/2025 </w:t>
       </w:r>
     </w:p>
     <w:p>
@@ -69,10 +60,18 @@
         <w:t>odul manajemen klien dan event</w:t>
       </w:r>
       <w:r>
-        <w:t xml:space="preserve"> asisten</w:t>
-      </w:r>
-      <w:r>
-        <w:t xml:space="preserve"> sudah selesai</w:t>
+        <w:t xml:space="preserve"> asisten sudah selesai</w:t>
+      </w:r>
+    </w:p>
+    <w:p/>
+    <w:p>
+      <w:r>
+        <w:t>05/12/2025</w:t>
+      </w:r>
+    </w:p>
+    <w:p>
+      <w:r>
+        <w:t>Modul fitur laporan sudah selesai</w:t>
       </w:r>
     </w:p>
     <w:sectPr>

</xml_diff>

<commit_message>
Final testing and bug fixes
</commit_message>
<xml_diff>
--- a/User Feedback (gonna be updated after every sprint).docx
+++ b/User Feedback (gonna be updated after every sprint).docx
@@ -72,6 +72,20 @@
     <w:p>
       <w:r>
         <w:t>Modul fitur laporan sudah selesai</w:t>
+      </w:r>
+    </w:p>
+    <w:p/>
+    <w:p>
+      <w:r>
+        <w:t>07/12/2025</w:t>
+      </w:r>
+    </w:p>
+    <w:p>
+      <w:r>
+        <w:t>Launching sistem final</w:t>
+      </w:r>
+      <w:r>
+        <w:t xml:space="preserve"> setelah testing dan bugfixing akhir</w:t>
       </w:r>
     </w:p>
     <w:sectPr>

</xml_diff>